<commit_message>
Phase 2 KPI scoring with tiers, NA exclusion, and phase selection
Login -> start screen (respondent info + phase selection) -> Phase 1 and/or 2 -> thank you. Phase 2 compares 7 sample KPIs per criterion with per-criterion tiers, drag-and-drop, guided n(n-1)/4 comparisons, LLS estimates, per-criterion KPI exclusion (NA with renormalized synthesis), and shared response IDs. Submissions stored in phase1-only/phase2-only/complete folders. Adds offline test tooling (mock worker, checks, response matcher).
</commit_message>
<xml_diff>
--- a/docs/AHP_survey.docx
+++ b/docs/AHP_survey.docx
@@ -371,13 +371,7 @@
         <w:rPr>
           <w:lang w:val="en-GB"/>
         </w:rPr>
-        <w:t>I</w:t>
-      </w:r>
-      <w:r>
-        <w:rPr>
-          <w:lang w:val="en-GB"/>
-        </w:rPr>
-        <w:t xml:space="preserve">s a </w:t>
+        <w:t xml:space="preserve">Is a </w:t>
       </w:r>
       <w:r>
         <w:t>Renovation under consideration</w:t>
@@ -1630,13 +1624,7 @@
         <w:rPr>
           <w:lang w:val="en-GB"/>
         </w:rPr>
-        <w:t>n(n-1)/</w:t>
-      </w:r>
-      <w:r>
-        <w:rPr>
-          <w:lang w:val="en-GB"/>
-        </w:rPr>
-        <w:t xml:space="preserve">4 </w:t>
+        <w:t xml:space="preserve">n(n-1)/4 </w:t>
       </w:r>
       <w:r>
         <w:rPr>
@@ -4559,6 +4547,7 @@
       </w:pPr>
       <w:r>
         <w:rPr>
+          <w:noProof/>
           <w:lang w:val="en-GB"/>
         </w:rPr>
         <w:lastRenderedPageBreak/>
@@ -4640,6 +4629,99 @@
           <w:lang w:val="en-GB"/>
         </w:rPr>
       </w:pPr>
+      <w:r>
+        <w:rPr>
+          <w:lang w:val="en-GB"/>
+        </w:rPr>
+        <w:t>Phase 2</w:t>
+      </w:r>
+    </w:p>
+    <w:p>
+      <w:pPr>
+        <w:pStyle w:val="ListParagraph"/>
+        <w:numPr>
+          <w:ilvl w:val="0"/>
+          <w:numId w:val="6"/>
+        </w:numPr>
+        <w:rPr>
+          <w:lang w:val="en-GB"/>
+        </w:rPr>
+      </w:pPr>
+      <w:r>
+        <w:rPr>
+          <w:lang w:val="en-GB"/>
+        </w:rPr>
+        <w:t xml:space="preserve">Criterion </w:t>
+      </w:r>
+      <w:r>
+        <w:rPr>
+          <w:lang w:val="en-GB"/>
+        </w:rPr>
+        <w:t>relevance to the Options</w:t>
+      </w:r>
+    </w:p>
+    <w:p>
+      <w:pPr>
+        <w:pStyle w:val="ListParagraph"/>
+        <w:ind w:left="360"/>
+        <w:rPr>
+          <w:lang w:val="en-GB"/>
+        </w:rPr>
+      </w:pPr>
+      <w:r>
+        <w:t>an "irrelevant" option isn't automatically the worst performer on every criterion</w:t>
+      </w:r>
+      <w:r>
+        <w:rPr>
+          <w:lang w:val="en-GB"/>
+        </w:rPr>
+        <w:t xml:space="preserve">. </w:t>
+      </w:r>
+      <w:r>
+        <w:rPr>
+          <w:lang w:val="en-GB"/>
+        </w:rPr>
+        <w:t>Mark the Option as “</w:t>
+      </w:r>
+      <w:r>
+        <w:t>N/A / cannot compare</w:t>
+      </w:r>
+      <w:r>
+        <w:rPr>
+          <w:lang w:val="en-GB"/>
+        </w:rPr>
+        <w:t xml:space="preserve">”. </w:t>
+      </w:r>
+    </w:p>
+    <w:p>
+      <w:pPr>
+        <w:pStyle w:val="ListParagraph"/>
+        <w:ind w:left="360"/>
+        <w:rPr>
+          <w:lang w:val="en-GB"/>
+        </w:rPr>
+      </w:pPr>
+      <w:r>
+        <w:t>If A is marked N/A for one or more criteria, A should not receive that criterion's weight contribution in the final additive synthesis at all</w:t>
+      </w:r>
+      <w:r>
+        <w:rPr>
+          <w:lang w:val="en-GB"/>
+        </w:rPr>
+        <w:t>.</w:t>
+      </w:r>
+      <w:r>
+        <w:t xml:space="preserve"> </w:t>
+      </w:r>
+      <w:r>
+        <w:rPr>
+          <w:lang w:val="en-GB"/>
+        </w:rPr>
+        <w:t>E</w:t>
+      </w:r>
+      <w:r>
+        <w:t>ffectively, A's overall score becomes a weighted sum over only the criteria where it was actually evaluated, with those criteria weights renormalized among themselves for A's calculation specifically. This is different from giving A a zero or a bottom-rank score on that criterion, which would unfairly penalize it for a dimension that was never meaningfully assessable</w:t>
+      </w:r>
     </w:p>
     <w:sectPr>
       <w:pgSz w:w="11906" w:h="16838"/>
@@ -4917,7 +4999,7 @@
   <w:abstractNum w:abstractNumId="2" w15:restartNumberingAfterBreak="0">
     <w:nsid w:val="480B1D3F"/>
     <w:multiLevelType w:val="hybridMultilevel"/>
-    <w:tmpl w:val="6F3CD296"/>
+    <w:tmpl w:val="B54A68EC"/>
     <w:lvl w:ilvl="0" w:tplc="1000000F">
       <w:start w:val="1"/>
       <w:numFmt w:val="decimal"/>
@@ -5004,6 +5086,95 @@
     </w:lvl>
   </w:abstractNum>
   <w:abstractNum w:abstractNumId="3" w15:restartNumberingAfterBreak="0">
+    <w:nsid w:val="4E056605"/>
+    <w:multiLevelType w:val="hybridMultilevel"/>
+    <w:tmpl w:val="375AD794"/>
+    <w:lvl w:ilvl="0" w:tplc="1000000F">
+      <w:start w:val="1"/>
+      <w:numFmt w:val="decimal"/>
+      <w:lvlText w:val="%1."/>
+      <w:lvlJc w:val="left"/>
+      <w:pPr>
+        <w:ind w:left="360" w:hanging="360"/>
+      </w:pPr>
+      <w:rPr>
+        <w:rFonts w:hint="default"/>
+      </w:rPr>
+    </w:lvl>
+    <w:lvl w:ilvl="1" w:tplc="10000019" w:tentative="1">
+      <w:start w:val="1"/>
+      <w:numFmt w:val="lowerLetter"/>
+      <w:lvlText w:val="%2."/>
+      <w:lvlJc w:val="left"/>
+      <w:pPr>
+        <w:ind w:left="1080" w:hanging="360"/>
+      </w:pPr>
+    </w:lvl>
+    <w:lvl w:ilvl="2" w:tplc="1000001B" w:tentative="1">
+      <w:start w:val="1"/>
+      <w:numFmt w:val="lowerRoman"/>
+      <w:lvlText w:val="%3."/>
+      <w:lvlJc w:val="right"/>
+      <w:pPr>
+        <w:ind w:left="1800" w:hanging="180"/>
+      </w:pPr>
+    </w:lvl>
+    <w:lvl w:ilvl="3" w:tplc="1000000F" w:tentative="1">
+      <w:start w:val="1"/>
+      <w:numFmt w:val="decimal"/>
+      <w:lvlText w:val="%4."/>
+      <w:lvlJc w:val="left"/>
+      <w:pPr>
+        <w:ind w:left="2520" w:hanging="360"/>
+      </w:pPr>
+    </w:lvl>
+    <w:lvl w:ilvl="4" w:tplc="10000019" w:tentative="1">
+      <w:start w:val="1"/>
+      <w:numFmt w:val="lowerLetter"/>
+      <w:lvlText w:val="%5."/>
+      <w:lvlJc w:val="left"/>
+      <w:pPr>
+        <w:ind w:left="3240" w:hanging="360"/>
+      </w:pPr>
+    </w:lvl>
+    <w:lvl w:ilvl="5" w:tplc="1000001B" w:tentative="1">
+      <w:start w:val="1"/>
+      <w:numFmt w:val="lowerRoman"/>
+      <w:lvlText w:val="%6."/>
+      <w:lvlJc w:val="right"/>
+      <w:pPr>
+        <w:ind w:left="3960" w:hanging="180"/>
+      </w:pPr>
+    </w:lvl>
+    <w:lvl w:ilvl="6" w:tplc="1000000F" w:tentative="1">
+      <w:start w:val="1"/>
+      <w:numFmt w:val="decimal"/>
+      <w:lvlText w:val="%7."/>
+      <w:lvlJc w:val="left"/>
+      <w:pPr>
+        <w:ind w:left="4680" w:hanging="360"/>
+      </w:pPr>
+    </w:lvl>
+    <w:lvl w:ilvl="7" w:tplc="10000019" w:tentative="1">
+      <w:start w:val="1"/>
+      <w:numFmt w:val="lowerLetter"/>
+      <w:lvlText w:val="%8."/>
+      <w:lvlJc w:val="left"/>
+      <w:pPr>
+        <w:ind w:left="5400" w:hanging="360"/>
+      </w:pPr>
+    </w:lvl>
+    <w:lvl w:ilvl="8" w:tplc="1000001B" w:tentative="1">
+      <w:start w:val="1"/>
+      <w:numFmt w:val="lowerRoman"/>
+      <w:lvlText w:val="%9."/>
+      <w:lvlJc w:val="right"/>
+      <w:pPr>
+        <w:ind w:left="6120" w:hanging="180"/>
+      </w:pPr>
+    </w:lvl>
+  </w:abstractNum>
+  <w:abstractNum w:abstractNumId="4" w15:restartNumberingAfterBreak="0">
     <w:nsid w:val="4EFD0CF2"/>
     <w:multiLevelType w:val="hybridMultilevel"/>
     <w:tmpl w:val="DF1E03B4"/>
@@ -5092,7 +5263,7 @@
       </w:pPr>
     </w:lvl>
   </w:abstractNum>
-  <w:abstractNum w:abstractNumId="4" w15:restartNumberingAfterBreak="0">
+  <w:abstractNum w:abstractNumId="5" w15:restartNumberingAfterBreak="0">
     <w:nsid w:val="55C07271"/>
     <w:multiLevelType w:val="hybridMultilevel"/>
     <w:tmpl w:val="713C6BFA"/>
@@ -5236,16 +5407,19 @@
     <w:abstractNumId w:val="0"/>
   </w:num>
   <w:num w:numId="2" w16cid:durableId="1859998745">
-    <w:abstractNumId w:val="4"/>
+    <w:abstractNumId w:val="5"/>
   </w:num>
   <w:num w:numId="3" w16cid:durableId="936065116">
-    <w:abstractNumId w:val="3"/>
+    <w:abstractNumId w:val="4"/>
   </w:num>
   <w:num w:numId="4" w16cid:durableId="597636150">
     <w:abstractNumId w:val="2"/>
   </w:num>
   <w:num w:numId="5" w16cid:durableId="586308047">
     <w:abstractNumId w:val="1"/>
+  </w:num>
+  <w:num w:numId="6" w16cid:durableId="1952013632">
+    <w:abstractNumId w:val="3"/>
   </w:num>
 </w:numbering>
 </file>

</xml_diff>